<commit_message>
Artifact Updated, Test Plan and Test Report Added
Requirements sheet also has ALL completion dates written and ready for submit.
</commit_message>
<xml_diff>
--- a/Documents/Project Artifacts Delivery.docx
+++ b/Documents/Project Artifacts Delivery.docx
@@ -400,7 +400,42 @@
       </w:r>
     </w:p>
     <w:p>
-      <w:r>
+      <w:pPr>
+        <w:ind w:left="720"/>
+        <w:rPr>
+          <w:color w:val="000000" w:themeColor="text1"/>
+        </w:rPr>
+      </w:pPr>
+      <w:r>
+        <w:rPr>
+          <w:color w:val="FF0000"/>
+        </w:rPr>
+        <w:t xml:space="preserve">NOTE: If any items are missing, please visit out GitHub at: </w:t>
+      </w:r>
+      <w:hyperlink r:id="rId4" w:history="1">
+        <w:r>
+          <w:rPr>
+            <w:rStyle w:val="Hyperlink"/>
+          </w:rPr>
+          <w:t>https://github.com/TKayaFox/Shattered-Protocols-Text-RP</w:t>
+        </w:r>
+        <w:r>
+          <w:rPr>
+            <w:rStyle w:val="Hyperlink"/>
+          </w:rPr>
+          <w:t>G</w:t>
+        </w:r>
+        <w:r>
+          <w:rPr>
+            <w:rStyle w:val="Hyperlink"/>
+          </w:rPr>
+          <w:t>/tree/Development</w:t>
+        </w:r>
+      </w:hyperlink>
+    </w:p>
+    <w:p>
+      <w:r>
+        <w:lastRenderedPageBreak/>
         <w:t>Reminder, each team member must submit an Individual Report (2 pages)</w:t>
       </w:r>
       <w:r>
@@ -1348,6 +1383,41 @@
       <w:spacing w:val="5"/>
     </w:rPr>
   </w:style>
+  <w:style w:type="character" w:styleId="Hyperlink">
+    <w:name w:val="Hyperlink"/>
+    <w:basedOn w:val="DefaultParagraphFont"/>
+    <w:uiPriority w:val="99"/>
+    <w:unhideWhenUsed/>
+    <w:rsid w:val="00DE0C45"/>
+    <w:rPr>
+      <w:color w:val="0000FF" w:themeColor="hyperlink"/>
+      <w:u w:val="single"/>
+    </w:rPr>
+  </w:style>
+  <w:style w:type="character" w:styleId="UnresolvedMention">
+    <w:name w:val="Unresolved Mention"/>
+    <w:basedOn w:val="DefaultParagraphFont"/>
+    <w:uiPriority w:val="99"/>
+    <w:semiHidden/>
+    <w:unhideWhenUsed/>
+    <w:rsid w:val="00DE0C45"/>
+    <w:rPr>
+      <w:color w:val="605E5C"/>
+      <w:shd w:val="clear" w:color="auto" w:fill="E1DFDD"/>
+    </w:rPr>
+  </w:style>
+  <w:style w:type="character" w:styleId="FollowedHyperlink">
+    <w:name w:val="FollowedHyperlink"/>
+    <w:basedOn w:val="DefaultParagraphFont"/>
+    <w:uiPriority w:val="99"/>
+    <w:semiHidden/>
+    <w:unhideWhenUsed/>
+    <w:rsid w:val="00DE0C45"/>
+    <w:rPr>
+      <w:color w:val="800080" w:themeColor="followedHyperlink"/>
+      <w:u w:val="single"/>
+    </w:rPr>
+  </w:style>
 </w:styles>
 </file>
 

</xml_diff>